<commit_message>
commit before the server.js and express
</commit_message>
<xml_diff>
--- a/research/Hitory.docx
+++ b/research/Hitory.docx
@@ -11,10 +11,7 @@
         <w:t>Telidon</w:t>
       </w:r>
       <w:r>
-        <w:t xml:space="preserve"> </w:t>
-      </w:r>
-      <w:r>
-        <w:t>(</w:t>
+        <w:t xml:space="preserve"> (</w:t>
       </w:r>
       <w:hyperlink r:id="rId5" w:history="1">
         <w:r>
@@ -25,10 +22,7 @@
         </w:r>
       </w:hyperlink>
       <w:r>
-        <w:t xml:space="preserve">) </w:t>
-      </w:r>
-      <w:r>
-        <w:t xml:space="preserve">was the first </w:t>
+        <w:t xml:space="preserve">) was the first </w:t>
       </w:r>
       <w:r>
         <w:t xml:space="preserve">Canadian </w:t>
@@ -195,8 +189,13 @@
       <w:r>
         <w:t xml:space="preserve">about mid-1980s. These networks were not connected to the ARPANET or </w:t>
       </w:r>
-      <w:r>
-        <w:t>NSFNET(backbone of the Internet)</w:t>
+      <w:proofErr w:type="gramStart"/>
+      <w:r>
+        <w:t>NSFNET(</w:t>
+      </w:r>
+      <w:proofErr w:type="gramEnd"/>
+      <w:r>
+        <w:t>backbone of the Internet)</w:t>
       </w:r>
       <w:r>
         <w:t xml:space="preserve">. These where </w:t>
@@ -215,14 +214,24 @@
       </w:r>
     </w:p>
     <w:p>
-      <w:pPr>
-        <w:rPr>
-          <w:b/>
-          <w:bCs/>
-        </w:rPr>
-      </w:pPr>
+      <w:proofErr w:type="gramStart"/>
+      <w:r>
+        <w:t>Video:</w:t>
+      </w:r>
+      <w:r>
+        <w:t>https://www.youtube.com/watch?v=vjMUe7hkwRs&amp;t=11s</w:t>
+      </w:r>
+      <w:proofErr w:type="gramEnd"/>
     </w:p>
     <w:p>
+      <w:pPr>
+        <w:rPr>
+          <w:b/>
+          <w:bCs/>
+        </w:rPr>
+      </w:pPr>
+    </w:p>
+    <w:p>
       <w:r>
         <w:rPr>
           <w:b/>
@@ -238,13 +247,7 @@
         <w:t xml:space="preserve">: </w:t>
       </w:r>
       <w:r>
-        <w:t>(</w:t>
-      </w:r>
-      <w:r>
-        <w:t>https://www.canarie.ca/a-birthday-for-canadas-internet/</w:t>
-      </w:r>
-      <w:r>
-        <w:t xml:space="preserve">) </w:t>
+        <w:t xml:space="preserve">(https://www.canarie.ca/a-birthday-for-canadas-internet/) </w:t>
       </w:r>
       <w:r>
         <w:t xml:space="preserve">NetNorth </w:t>
@@ -301,13 +304,7 @@
           <w:rPr>
             <w:rStyle w:val="Hyperlink"/>
           </w:rPr>
-          <w:t>https://www.canarie.ca/wp-content/uploads/2021/02/Publication-A-Nation-Goes-Online.pdf)</w:t>
-        </w:r>
-        <w:r>
-          <w:rPr>
-            <w:rStyle w:val="Hyperlink"/>
-          </w:rPr>
-          <w:t xml:space="preserve"> universities</w:t>
+          <w:t>https://www.canarie.ca/wp-content/uploads/2021/02/Publication-A-Nation-Goes-Online.pdf) universities</w:t>
         </w:r>
       </w:hyperlink>
       <w:r>
@@ -317,67 +314,41 @@
         <w:t xml:space="preserve"> </w:t>
       </w:r>
       <w:r>
-        <w:t>In 1983</w:t>
-      </w:r>
-      <w:r>
-        <w:t>.</w:t>
-      </w:r>
+        <w:t xml:space="preserve">In 1983. They had joint graduate programs, and there was a big computer purchased at Waterloo.  They wanted to move their data back and forth between the two universities and be able to log into that computer from </w:t>
+      </w:r>
+      <w:r>
+        <w:t>Guelph</w:t>
+      </w:r>
+      <w:r>
+        <w:t xml:space="preserve">. This became a </w:t>
+      </w:r>
+      <w:r>
+        <w:t>motivation</w:t>
+      </w:r>
+      <w:r>
+        <w:t xml:space="preserve"> in the ACSD conference </w:t>
+      </w:r>
+      <w:r>
+        <w:t>held in Toronto at Ryerson Polytechnic Institute in November 1983</w:t>
+      </w:r>
+      <w:r>
+        <w:t xml:space="preserve"> to build a network </w:t>
+      </w:r>
+      <w:proofErr w:type="gramStart"/>
+      <w:r>
+        <w:t>similar to</w:t>
+      </w:r>
+      <w:proofErr w:type="gramEnd"/>
       <w:r>
         <w:t xml:space="preserve"> </w:t>
       </w:r>
-      <w:r>
-        <w:t>They</w:t>
-      </w:r>
-      <w:r>
-        <w:t xml:space="preserve"> had joint graduate programs</w:t>
-      </w:r>
-      <w:r>
-        <w:t>, and</w:t>
-      </w:r>
-      <w:r>
-        <w:t xml:space="preserve"> </w:t>
-      </w:r>
-      <w:r>
-        <w:t xml:space="preserve">there was </w:t>
-      </w:r>
-      <w:r>
-        <w:t>a big computer purchased at Waterloo</w:t>
-      </w:r>
-      <w:r>
-        <w:t xml:space="preserve">. </w:t>
-      </w:r>
-      <w:r>
-        <w:t xml:space="preserve"> </w:t>
-      </w:r>
-      <w:r>
-        <w:t>T</w:t>
-      </w:r>
-      <w:r>
-        <w:t>hey wanted to move their data back and forth between the two universities</w:t>
-      </w:r>
-      <w:r>
-        <w:t xml:space="preserve"> and </w:t>
-      </w:r>
-      <w:r>
-        <w:t xml:space="preserve">be able to log into that computer from </w:t>
-      </w:r>
-      <w:r>
-        <w:t>Guelph</w:t>
-      </w:r>
-      <w:r>
-        <w:t xml:space="preserve">. This became a </w:t>
-      </w:r>
-      <w:r>
-        <w:t>motivation</w:t>
-      </w:r>
-      <w:r>
-        <w:t xml:space="preserve"> in the ACSD conference </w:t>
-      </w:r>
-      <w:r>
-        <w:t>held in Toronto at Ryerson Polytechnic Institute in November 1983</w:t>
-      </w:r>
-      <w:r>
-        <w:t xml:space="preserve"> to build a network similar to BITNET , in U.S., to </w:t>
+      <w:proofErr w:type="gramStart"/>
+      <w:r>
+        <w:t>BITNET ,</w:t>
+      </w:r>
+      <w:proofErr w:type="gramEnd"/>
+      <w:r>
+        <w:t xml:space="preserve"> in U.S., to </w:t>
       </w:r>
       <w:r>
         <w:t>context</w:t>
@@ -388,13 +359,7 @@
     </w:p>
     <w:p>
       <w:r>
-        <w:t xml:space="preserve">NetNorth </w:t>
-      </w:r>
-      <w:r>
-        <w:t xml:space="preserve"> us</w:t>
-      </w:r>
-      <w:r>
-        <w:t>ed</w:t>
+        <w:t>NetNorth  used</w:t>
       </w:r>
       <w:r>
         <w:t> IBM's Network Job Entry protocol</w:t>
@@ -402,7 +367,7 @@
       <w:r>
         <w:t>(</w:t>
       </w:r>
-      <w:hyperlink r:id="rId7" w:history="1">
+      <w:hyperlink r:id="rId7" w:anchor=":~:text=Publisher%20Summary,to%20provide%20file%2Dtransfer%20services" w:history="1">
         <w:r>
           <w:rPr>
             <w:rStyle w:val="Hyperlink"/>
@@ -421,6 +386,7 @@
       </w:r>
     </w:p>
     <w:p>
+      <w:proofErr w:type="gramStart"/>
       <w:r>
         <w:rPr>
           <w:b/>
@@ -435,6 +401,7 @@
         </w:rPr>
         <w:t>(</w:t>
       </w:r>
+      <w:proofErr w:type="gramEnd"/>
       <w:r>
         <w:rPr>
           <w:b/>
@@ -479,22 +446,21 @@
         <w:t xml:space="preserve">National Science Foundation </w:t>
       </w:r>
       <w:r>
-        <w:t xml:space="preserve">(NSF) funded a project to create an academic research network, called </w:t>
-      </w:r>
-      <w:r>
-        <w:t>NSFNET</w:t>
-      </w:r>
-      <w:r>
-        <w:t>,</w:t>
-      </w:r>
-      <w:r>
-        <w:t xml:space="preserve"> </w:t>
-      </w:r>
-      <w:r>
-        <w:t xml:space="preserve"> to facilitate access by researchers to the supercomputing centers. NSFNET applied TCP/IP protocols which was initially deployed successfully by ARPANET. NSFNET became the </w:t>
+        <w:t xml:space="preserve">(NSF) funded a project to create an academic research network, </w:t>
       </w:r>
       <w:r>
         <w:lastRenderedPageBreak/>
+        <w:t xml:space="preserve">called </w:t>
+      </w:r>
+      <w:proofErr w:type="gramStart"/>
+      <w:r>
+        <w:t>NSFNET,  to</w:t>
+      </w:r>
+      <w:proofErr w:type="gramEnd"/>
+      <w:r>
+        <w:t xml:space="preserve"> facilitate access by researchers to the supercomputing centers. NSFNET applied TCP/IP protocols which was initially deployed successfully by ARPANET. NSFNET became the </w:t>
+      </w:r>
+      <w:r>
         <w:t xml:space="preserve">Internet </w:t>
       </w:r>
       <w:r>
@@ -564,7 +530,11 @@
         <w:t>:</w:t>
       </w:r>
       <w:r>
-        <w:t xml:space="preserve">(https://www.canarie.ca/a-birthday-for-canadas-internet/) </w:t>
+        <w:t>(</w:t>
+      </w:r>
+      <w:proofErr w:type="gramStart"/>
+      <w:r>
+        <w:t xml:space="preserve">https://www.canarie.ca/a-birthday-for-canadas-internet/) </w:t>
       </w:r>
       <w:r>
         <w:rPr>
@@ -574,7 +544,11 @@
         <w:t xml:space="preserve"> </w:t>
       </w:r>
       <w:r>
-        <w:t xml:space="preserve"> In 1989, the group that managed NetNorth decided to apply the TCP/IP standard, which was introduced in the US by </w:t>
+        <w:t xml:space="preserve"> </w:t>
+      </w:r>
+      <w:proofErr w:type="gramEnd"/>
+      <w:r>
+        <w:t xml:space="preserve">In 1989, the group that managed NetNorth decided to apply the TCP/IP standard, which was introduced in the US by </w:t>
       </w:r>
       <w:r>
         <w:t>ARPA (Advanced Research Projects Agency)</w:t>
@@ -607,17 +581,26 @@
         <w:t>some of</w:t>
       </w:r>
       <w:r>
-        <w:t xml:space="preserve"> them had already implemented TCP/IP, </w:t>
+        <w:t xml:space="preserve"> them had already implemented TCP/</w:t>
+      </w:r>
+      <w:proofErr w:type="gramStart"/>
+      <w:r>
+        <w:t xml:space="preserve">IP, </w:t>
       </w:r>
       <w:r>
         <w:t xml:space="preserve"> </w:t>
       </w:r>
       <w:r>
-        <w:t xml:space="preserve">as well as connection to some other </w:t>
+        <w:t>as</w:t>
+      </w:r>
+      <w:proofErr w:type="gramEnd"/>
+      <w:r>
+        <w:t xml:space="preserve"> well as connection to some other </w:t>
       </w:r>
       <w:r>
         <w:t xml:space="preserve">external networks, </w:t>
       </w:r>
+      <w:proofErr w:type="gramStart"/>
       <w:r>
         <w:t xml:space="preserve">including </w:t>
       </w:r>
@@ -625,7 +608,11 @@
         <w:t xml:space="preserve"> </w:t>
       </w:r>
       <w:r>
-        <w:t xml:space="preserve">ARPANET </w:t>
+        <w:t>ARPANET</w:t>
+      </w:r>
+      <w:proofErr w:type="gramEnd"/>
+      <w:r>
+        <w:t xml:space="preserve"> </w:t>
       </w:r>
       <w:r>
         <w:t xml:space="preserve"> and later </w:t>
@@ -640,10 +627,7 @@
         <w:t xml:space="preserve"> in the U.S.</w:t>
       </w:r>
       <w:r>
-        <w:t xml:space="preserve"> </w:t>
-      </w:r>
-      <w:r>
-        <w:t>This idea</w:t>
+        <w:t xml:space="preserve"> This idea</w:t>
       </w:r>
       <w:r>
         <w:t xml:space="preserve"> was supported by Canada’s National Research Council </w:t>
@@ -789,17 +773,18 @@
     </w:p>
     <w:p>
       <w:pPr>
-        <w:rPr>
-          <w:b/>
-          <w:bCs/>
-        </w:rPr>
-      </w:pPr>
-      <w:r>
-        <w:rPr>
-          <w:b/>
-          <w:bCs/>
-        </w:rPr>
-        <w:t>ISPs</w:t>
+        <w:pBdr>
+          <w:bottom w:val="single" w:sz="12" w:space="1" w:color="auto"/>
+        </w:pBdr>
+      </w:pPr>
+      <w:r>
+        <w:t>Video:</w:t>
+      </w:r>
+      <w:r>
+        <w:t xml:space="preserve"> </w:t>
+      </w:r>
+      <w:r>
+        <w:t>https://www.youtube.com/watch?v=vaqHLxs2h0E&amp;t=30s</w:t>
       </w:r>
     </w:p>
     <w:p>
@@ -814,78 +799,107 @@
           <w:b/>
           <w:bCs/>
         </w:rPr>
-        <w:t>Dial-up:</w:t>
+        <w:t>ISPs</w:t>
       </w:r>
     </w:p>
     <w:p>
-      <w:r>
-        <w:rPr>
-          <w:b/>
-          <w:bCs/>
-        </w:rPr>
-        <w:t>UUNET(</w:t>
-      </w:r>
-      <w:r>
-        <w:rPr>
-          <w:b/>
-          <w:bCs/>
-        </w:rPr>
-        <w:t>https://www.canarie.ca/wp-content/uploads/2021/02/Publication-A-Nation-Goes-Online.pdf</w:t>
-      </w:r>
-      <w:r>
-        <w:rPr>
-          <w:b/>
-          <w:bCs/>
-        </w:rPr>
-        <w:t>):</w:t>
-      </w:r>
-      <w:r>
-        <w:t xml:space="preserve"> </w:t>
-      </w:r>
-      <w:r>
-        <w:t>UUNET Canada was t</w:t>
-      </w:r>
-      <w:r>
-        <w:t xml:space="preserve">he </w:t>
-      </w:r>
-      <w:r>
-        <w:t xml:space="preserve">first </w:t>
-      </w:r>
-      <w:r>
-        <w:t>commercial ISP in Canada was established in 1991.</w:t>
-      </w:r>
-      <w:r>
-        <w:t xml:space="preserve"> The motivation behind it was that for individuals and organizations denied access by provincial networks and CA*net, the only option remained </w:t>
-      </w:r>
-      <w:r>
-        <w:t>the comparatively slow and functionally limited networks such as Usenet that operated using temporary dialup connections between nodes over regular phone lines.</w:t>
-      </w:r>
-      <w:r>
-        <w:t xml:space="preserve"> </w:t>
-      </w:r>
-      <w:r>
-        <w:t xml:space="preserve">UUNET Canada </w:t>
-      </w:r>
-      <w:r>
-        <w:t>was 20% owned by the US network provider UUNET Technologies, founded in 1987. U.S., as the first commercial provider</w:t>
-      </w:r>
-      <w:r>
-        <w:t xml:space="preserve">. </w:t>
-      </w:r>
-      <w:r>
-        <w:t xml:space="preserve">UUNET Technologies, </w:t>
-      </w:r>
-      <w:r>
-        <w:t xml:space="preserve"> constructed its own network called AlterNet, and UUNET Canada gained access to this network. Later UUNET </w:t>
-      </w:r>
-      <w:r>
-        <w:t xml:space="preserve">Canada </w:t>
-      </w:r>
-      <w:r>
-        <w:t xml:space="preserve">constructed its own network known as AlterNet Canada. </w:t>
+      <w:pPr>
+        <w:rPr>
+          <w:b/>
+          <w:bCs/>
+        </w:rPr>
+      </w:pPr>
+      <w:r>
+        <w:rPr>
+          <w:b/>
+          <w:bCs/>
+        </w:rPr>
+        <w:t>Dial-up:</w:t>
       </w:r>
     </w:p>
     <w:p>
+      <w:proofErr w:type="gramStart"/>
+      <w:r>
+        <w:rPr>
+          <w:b/>
+          <w:bCs/>
+        </w:rPr>
+        <w:t>UUNET(</w:t>
+      </w:r>
+      <w:proofErr w:type="gramEnd"/>
+      <w:r>
+        <w:rPr>
+          <w:b/>
+          <w:bCs/>
+        </w:rPr>
+        <w:t>https://www.canarie.ca/wp-content/uploads/2021/02/Publication-A-Nation-Goes-Online.pdf</w:t>
+      </w:r>
+      <w:r>
+        <w:rPr>
+          <w:b/>
+          <w:bCs/>
+        </w:rPr>
+        <w:t>):</w:t>
+      </w:r>
+      <w:r>
+        <w:t xml:space="preserve"> </w:t>
+      </w:r>
+      <w:r>
+        <w:t>UUNET Canada was t</w:t>
+      </w:r>
+      <w:r>
+        <w:t xml:space="preserve">he </w:t>
+      </w:r>
+      <w:r>
+        <w:t xml:space="preserve">first </w:t>
+      </w:r>
+      <w:r>
+        <w:t>commercial ISP in Canada was established in 1991.</w:t>
+      </w:r>
+      <w:r>
+        <w:t xml:space="preserve"> The motivation behind it was that for individuals and organizations denied access by provincial networks and CA*net, the only option remained </w:t>
+      </w:r>
+      <w:r>
+        <w:t>the comparatively slow and functionally limited networks such as Usenet that operated using temporary dialup connections between nodes over regular phone lines.</w:t>
+      </w:r>
+      <w:r>
+        <w:t xml:space="preserve"> </w:t>
+      </w:r>
+      <w:r>
+        <w:t xml:space="preserve">UUNET Canada </w:t>
+      </w:r>
+      <w:r>
+        <w:t>was 20% owned by the US network provider UUNET Technologies, founded in 1987. U.S., as the first commercial provider</w:t>
+      </w:r>
+      <w:r>
+        <w:t xml:space="preserve">. </w:t>
+      </w:r>
+      <w:r>
+        <w:t xml:space="preserve">UUNET </w:t>
+      </w:r>
+      <w:proofErr w:type="gramStart"/>
+      <w:r>
+        <w:t xml:space="preserve">Technologies, </w:t>
+      </w:r>
+      <w:r>
+        <w:t xml:space="preserve"> </w:t>
+      </w:r>
+      <w:r>
+        <w:lastRenderedPageBreak/>
+        <w:t>constructed</w:t>
+      </w:r>
+      <w:proofErr w:type="gramEnd"/>
+      <w:r>
+        <w:t xml:space="preserve"> its own network called AlterNet, and UUNET Canada gained access to this network. Later UUNET </w:t>
+      </w:r>
+      <w:r>
+        <w:t xml:space="preserve">Canada </w:t>
+      </w:r>
+      <w:r>
+        <w:t xml:space="preserve">constructed its own network known as AlterNet Canada. </w:t>
+      </w:r>
+    </w:p>
+    <w:p>
       <w:r>
         <w:rPr>
           <w:b/>
@@ -918,11 +932,7 @@
         <w:t xml:space="preserve">: </w:t>
       </w:r>
       <w:r>
-        <w:t xml:space="preserve">founded in 1994, carved its niche not only as another national ISP but also as the first to offer a </w:t>
-      </w:r>
-      <w:r>
-        <w:lastRenderedPageBreak/>
-        <w:t>high-speed internet service in Canada. The considerable rise in commercial ISPs during this era played a vital part in promoting internet usage among the broader Canadian public.</w:t>
+        <w:t>founded in 1994, carved its niche not only as another national ISP but also as the first to offer a high-speed internet service in Canada. The considerable rise in commercial ISPs during this era played a vital part in promoting internet usage among the broader Canadian public.</w:t>
       </w:r>
       <w:r>
         <w:t xml:space="preserve"> Later in 1997, PSINet </w:t>
@@ -991,10 +1001,7 @@
         <w:t xml:space="preserve"> </w:t>
       </w:r>
       <w:r>
-        <w:t xml:space="preserve">1995, </w:t>
-      </w:r>
-      <w:r>
-        <w:t>In December 1995, Netcom Canada, a subsidiary of Netcom On-line, was launched in </w:t>
+        <w:t>1995, In December 1995, Netcom Canada, a subsidiary of Netcom On-line, was launched in </w:t>
       </w:r>
       <w:hyperlink r:id="rId10" w:tooltip="Toronto" w:history="1">
         <w:r>
@@ -1018,7 +1025,15 @@
         </w:r>
       </w:hyperlink>
       <w:r>
-        <w:t> as its CEO. Netcom Canada boasted a Canada-wide network, and allowed U.S. Netcom customers to access their Internet accounts via their network using either NetCruiser or any PPP dialer.</w:t>
+        <w:t xml:space="preserve"> as its CEO. Netcom Canada boasted a Canada-wide </w:t>
+      </w:r>
+      <w:proofErr w:type="gramStart"/>
+      <w:r>
+        <w:t>network, and</w:t>
+      </w:r>
+      <w:proofErr w:type="gramEnd"/>
+      <w:r>
+        <w:t xml:space="preserve"> allowed U.S. Netcom customers to access their Internet accounts via their network using either NetCruiser or any PPP dialer.</w:t>
       </w:r>
     </w:p>
     <w:p/>
@@ -1053,6 +1068,7 @@
       </w:r>
     </w:p>
     <w:p>
+      <w:proofErr w:type="gramStart"/>
       <w:r>
         <w:rPr>
           <w:b/>
@@ -1065,11 +1081,28 @@
           <w:b/>
           <w:bCs/>
         </w:rPr>
-        <w:t>(Bell Canada)</w:t>
-      </w:r>
-      <w:r>
         <w:t>(</w:t>
       </w:r>
+      <w:proofErr w:type="gramEnd"/>
+      <w:r>
+        <w:rPr>
+          <w:b/>
+          <w:bCs/>
+        </w:rPr>
+        <w:t xml:space="preserve">Bell </w:t>
+      </w:r>
+      <w:proofErr w:type="gramStart"/>
+      <w:r>
+        <w:rPr>
+          <w:b/>
+          <w:bCs/>
+        </w:rPr>
+        <w:t>Canada)</w:t>
+      </w:r>
+      <w:r>
+        <w:t>(</w:t>
+      </w:r>
+      <w:proofErr w:type="gramEnd"/>
       <w:r>
         <w:t>https://en.wikipedia.org/wiki/Bell_Internet</w:t>
       </w:r>
@@ -1145,13 +1178,7 @@
         <w:t>Telus</w:t>
       </w:r>
       <w:r>
-        <w:t>(</w:t>
-      </w:r>
-      <w:r>
-        <w:t>https://assets.ctfassets.net/fltupc9ltp8m/5nrtxy6gcUJ6lwdjN5nS09/5f942c1f4e89a0a31066e3cc12a51dfd/_SIA-4j__Issue_Date__Aug._22__1997_</w:t>
-      </w:r>
-      <w:r>
-        <w:t>)</w:t>
+        <w:t>(https://assets.ctfassets.net/fltupc9ltp8m/5nrtxy6gcUJ6lwdjN5nS09/5f942c1f4e89a0a31066e3cc12a51dfd/_SIA-4j__Issue_Date__Aug._22__1997_)</w:t>
       </w:r>
       <w:r>
         <w:t>:</w:t>
@@ -1267,10 +1294,7 @@
       </w:r>
       <w:hyperlink r:id="rId16" w:history="1">
         <w:r>
-          <w:t>https://en.wikipedia.org/wiki/Rogers_Xfinity?utm_source=chatgpt.com</w:t>
-        </w:r>
-        <w:r>
-          <w:t>): In</w:t>
+          <w:t>https://en.wikipedia.org/wiki/Rogers_Xfinity?utm_source=chatgpt.com): In</w:t>
         </w:r>
       </w:hyperlink>
       <w:r>
@@ -1280,7 +1304,11 @@
         <w:t>Rogers began offering high-speed internet service</w:t>
       </w:r>
       <w:r>
-        <w:t xml:space="preserve"> with a technology named Cable Internet which was branded as </w:t>
+        <w:t xml:space="preserve"> with a technology named Cable Internet which was </w:t>
+      </w:r>
+      <w:r>
+        <w:lastRenderedPageBreak/>
+        <w:t xml:space="preserve">branded as </w:t>
       </w:r>
       <w:r>
         <w:t>Hy</w:t>
@@ -1302,10 +1330,12 @@
           <w:b/>
           <w:bCs/>
         </w:rPr>
-        <w:lastRenderedPageBreak/>
         <w:br/>
       </w:r>
       <w:r>
+        <w:rPr>
+          <w:noProof/>
+        </w:rPr>
         <w:drawing>
           <wp:inline distT="0" distB="0" distL="0" distR="0" wp14:anchorId="4905ABD6" wp14:editId="4F864BB1">
             <wp:extent cx="5943600" cy="4860290"/>
@@ -1348,7 +1378,10 @@
         <w:t xml:space="preserve"> </w:t>
       </w:r>
       <w:r>
-        <w:t>Cable Internet(</w:t>
+        <w:t>Hybrid Fiber</w:t>
+      </w:r>
+      <w:r>
+        <w:t>(</w:t>
       </w:r>
       <w:r>
         <w:t>file:///C:/Users/hraha/Downloads/14281.pdf</w:t>
@@ -1381,13 +1414,7 @@
         <w:t>Bell Aliant</w:t>
       </w:r>
       <w:r>
-        <w:t>(</w:t>
-      </w:r>
-      <w:r>
-        <w:t>https://en.wikipedia.org/wiki/Fibe_%28Bell_Aliant%29?utm_source=chatgpt.com</w:t>
-      </w:r>
-      <w:r>
-        <w:t xml:space="preserve">):  </w:t>
+        <w:t xml:space="preserve">(https://en.wikipedia.org/wiki/Fibe_%28Bell_Aliant%29?utm_source=chatgpt.com):  </w:t>
       </w:r>
       <w:r>
         <w:t>In 2009, Bell Aliant launched its FiberOP</w:t>
@@ -1438,10 +1465,7 @@
         <w:t xml:space="preserve"> </w:t>
       </w:r>
       <w:r>
-        <w:t xml:space="preserve">Bell Aliant extended its </w:t>
-      </w:r>
-      <w:r>
-        <w:t>FiberO</w:t>
+        <w:t>Bell Aliant extended its FiberO</w:t>
       </w:r>
       <w:r>
         <w:t>P</w:t>
@@ -1473,6 +1497,9 @@
     </w:p>
     <w:p>
       <w:r>
+        <w:rPr>
+          <w:noProof/>
+        </w:rPr>
         <w:lastRenderedPageBreak/>
         <w:drawing>
           <wp:inline distT="0" distB="0" distL="0" distR="0" wp14:anchorId="18A85115" wp14:editId="23C9EA5B">
@@ -1527,13 +1554,7 @@
         <w:t xml:space="preserve">FTTH Schematic Diagram </w:t>
       </w:r>
       <w:r>
-        <w:t>(</w:t>
-      </w:r>
-      <w:r>
-        <w:t>https://www.novascotia.ca/sites/default/files/documents/1-1066/middle-mile-strategy-en.pdf</w:t>
-      </w:r>
-      <w:r>
-        <w:t>)</w:t>
+        <w:t>(https://www.novascotia.ca/sites/default/files/documents/1-1066/middle-mile-strategy-en.pdf)</w:t>
       </w:r>
     </w:p>
     <w:p>
@@ -1551,13 +1572,7 @@
         <w:t>Bell Canada</w:t>
       </w:r>
       <w:r>
-        <w:t xml:space="preserve"> (</w:t>
-      </w:r>
-      <w:r>
-        <w:t>https://www.newswire.ca/news-releases/bell-high-speed-fibre-rollouts-enable-new-internet-and-tv-services---bellsnew-fibetm-internet-service-now-offers-fastest-upload-speeds-in-the-market-539266571.html</w:t>
-      </w:r>
-      <w:r>
-        <w:t>)</w:t>
+        <w:t xml:space="preserve"> (https://www.newswire.ca/news-releases/bell-high-speed-fibre-rollouts-enable-new-internet-and-tv-services---bellsnew-fibetm-internet-service-now-offers-fastest-upload-speeds-in-the-market-539266571.html)</w:t>
       </w:r>
       <w:r>
         <w:t>:</w:t>
@@ -1732,12 +1747,23 @@
         <w:t xml:space="preserve"> </w:t>
       </w:r>
       <w:r>
-        <w:t>was providing three type of services as follows:</w:t>
+        <w:t xml:space="preserve">was providing three </w:t>
+      </w:r>
+      <w:proofErr w:type="gramStart"/>
+      <w:r>
+        <w:t>type</w:t>
+      </w:r>
+      <w:proofErr w:type="gramEnd"/>
+      <w:r>
+        <w:t xml:space="preserve"> of services as follows:</w:t>
       </w:r>
       <w:r>
         <w:br/>
       </w:r>
       <w:r>
+        <w:rPr>
+          <w:noProof/>
+        </w:rPr>
         <w:drawing>
           <wp:inline distT="0" distB="0" distL="0" distR="0" wp14:anchorId="53BDFD86" wp14:editId="3AB3CE9A">
             <wp:extent cx="5820587" cy="1752845"/>
@@ -1777,13 +1803,7 @@
     </w:p>
     <w:p>
       <w:r>
-        <w:t xml:space="preserve">The spectrum and technology </w:t>
-      </w:r>
-      <w:r>
-        <w:t>were</w:t>
-      </w:r>
-      <w:r>
-        <w:t xml:space="preserve"> merged into the joint venture with Bell</w:t>
+        <w:t>The spectrum and technology were merged into the joint venture with Bell</w:t>
       </w:r>
       <w:r>
         <w:t xml:space="preserve"> (which was named Sympatico </w:t>
@@ -1816,6 +1836,9 @@
     <w:p/>
     <w:p>
       <w:r>
+        <w:rPr>
+          <w:noProof/>
+        </w:rPr>
         <w:drawing>
           <wp:inline distT="0" distB="0" distL="0" distR="0" wp14:anchorId="150A584B" wp14:editId="48E9EC78">
             <wp:extent cx="5696745" cy="1781424"/>
@@ -2018,7 +2041,15 @@
     <w:p>
       <w:r>
         <w:lastRenderedPageBreak/>
-        <w:t>In April, 2007, Project Chapleau concluded without a reason being given. The Project Chapleau office (The Chapleau Innovation Centre) was converted into a public internet access point, with job search and community networking facilities</w:t>
+        <w:t xml:space="preserve">In </w:t>
+      </w:r>
+      <w:proofErr w:type="gramStart"/>
+      <w:r>
+        <w:t>April,</w:t>
+      </w:r>
+      <w:proofErr w:type="gramEnd"/>
+      <w:r>
+        <w:t xml:space="preserve"> 2007, Project Chapleau concluded without a reason being given. The Project Chapleau office (The Chapleau Innovation Centre) was converted into a public internet access point, with job search and community networking facilities</w:t>
       </w:r>
       <w:r>
         <w:t xml:space="preserve"> (</w:t>
@@ -2056,7 +2087,11 @@
         <w:t>)</w:t>
       </w:r>
       <w:r>
-        <w:t>: In 2025,</w:t>
+        <w:t xml:space="preserve">: In </w:t>
+      </w:r>
+      <w:proofErr w:type="gramStart"/>
+      <w:r>
+        <w:t>2025,</w:t>
       </w:r>
       <w:r>
         <w:t xml:space="preserve"> </w:t>
@@ -2065,7 +2100,11 @@
         <w:t xml:space="preserve"> </w:t>
       </w:r>
       <w:r>
-        <w:t>Xplore Inc., a Canadian-based internet provider, announced the launch of 5G Ultra, a new generation of wireless home Internet.</w:t>
+        <w:t>Xplore</w:t>
+      </w:r>
+      <w:proofErr w:type="gramEnd"/>
+      <w:r>
+        <w:t xml:space="preserve"> Inc., a Canadian-based internet provider, announced the launch of 5G Ultra, a new generation of wireless home Internet.</w:t>
       </w:r>
       <w:r>
         <w:t xml:space="preserve"> </w:t>
@@ -2080,7 +2119,15 @@
         <w:t xml:space="preserve">echnology </w:t>
       </w:r>
       <w:r>
-        <w:t xml:space="preserve">works similar to 5G cellular networks. The signals are </w:t>
+        <w:t xml:space="preserve">works </w:t>
+      </w:r>
+      <w:proofErr w:type="gramStart"/>
+      <w:r>
+        <w:t>similar to</w:t>
+      </w:r>
+      <w:proofErr w:type="gramEnd"/>
+      <w:r>
+        <w:t xml:space="preserve"> 5G cellular networks. The signals are </w:t>
       </w:r>
       <w:r>
         <w:t>transmitted</w:t>
@@ -2097,6 +2144,9 @@
     </w:p>
     <w:p>
       <w:r>
+        <w:rPr>
+          <w:noProof/>
+        </w:rPr>
         <w:drawing>
           <wp:inline distT="0" distB="0" distL="0" distR="0" wp14:anchorId="04597A56" wp14:editId="4B0DC9AB">
             <wp:extent cx="5943600" cy="3639185"/>
@@ -2154,10 +2204,7 @@
         <w:t xml:space="preserve">5G </w:t>
       </w:r>
       <w:r>
-        <w:t>Schematic Diagram</w:t>
-      </w:r>
-      <w:r>
-        <w:t xml:space="preserve"> (</w:t>
+        <w:t>Schematic Diagram (</w:t>
       </w:r>
       <w:hyperlink r:id="rId32" w:history="1">
         <w:r>
@@ -2268,10 +2315,18 @@
         <w:t>114</w:t>
       </w:r>
       <w:r>
-        <w:t xml:space="preserve"> kbit/s</w:t>
-      </w:r>
-      <w:r>
-        <w:t xml:space="preserve">,  and EDGS was limited to 384 </w:t>
+        <w:t xml:space="preserve"> kbit/</w:t>
+      </w:r>
+      <w:proofErr w:type="gramStart"/>
+      <w:r>
+        <w:t>s</w:t>
+      </w:r>
+      <w:r>
+        <w:t>,  and</w:t>
+      </w:r>
+      <w:proofErr w:type="gramEnd"/>
+      <w:r>
+        <w:t xml:space="preserve"> EDGS was limited to 384 </w:t>
       </w:r>
       <w:r>
         <w:t>kbit/s</w:t>
@@ -2285,11 +2340,16 @@
       <w:r>
         <w:t>https://en.wikipedia.org/wiki/EDGE_(telecommunication)</w:t>
       </w:r>
+      <w:proofErr w:type="gramStart"/>
       <w:r>
         <w:t xml:space="preserve">),  </w:t>
       </w:r>
       <w:r>
-        <w:t xml:space="preserve">which is only about four times the </w:t>
+        <w:t>which</w:t>
+      </w:r>
+      <w:proofErr w:type="gramEnd"/>
+      <w:r>
+        <w:t xml:space="preserve"> is only about four times the </w:t>
       </w:r>
       <w:r>
         <w:t>speed of dial-up.</w:t>
@@ -2435,16 +2495,7 @@
         <w:t xml:space="preserve"> </w:t>
       </w:r>
       <w:r>
-        <w:t>(</w:t>
-      </w:r>
-      <w:r>
-        <w:t>https://en.wikipedia.org/wiki/Telecommunications_Act_%28Canada%29</w:t>
-      </w:r>
-      <w:r>
-        <w:t>):</w:t>
-      </w:r>
-      <w:r>
-        <w:t>The Telecommunications</w:t>
+        <w:t>(https://en.wikipedia.org/wiki/Telecommunications_Act_%28Canada%29):The Telecommunications</w:t>
       </w:r>
       <w:r>
         <w:rPr>
@@ -2519,22 +2570,13 @@
         <w:t xml:space="preserve"> </w:t>
       </w:r>
       <w:r>
-        <w:t>(</w:t>
-      </w:r>
-      <w:r>
-        <w:t>https://en.wikipedia.org/wiki/Personal_Information_Protection_and_Electronic_Documents_Act</w:t>
-      </w:r>
-      <w:r>
-        <w:t>):</w:t>
+        <w:t>(https://en.wikipedia.org/wiki/Personal_Information_Protection_and_Electronic_Documents_Act):</w:t>
       </w:r>
       <w:r>
         <w:t xml:space="preserve"> </w:t>
       </w:r>
       <w:r>
-        <w:t>Personal Information Protection and Electronic Documents Act (PIPEDA</w:t>
-      </w:r>
-      <w:r>
-        <w:t>)</w:t>
+        <w:t>Personal Information Protection and Electronic Documents Act (PIPEDA)</w:t>
       </w:r>
       <w:r>
         <w:t xml:space="preserve"> </w:t>
@@ -2692,9 +2734,6 @@
           <w:ilvl w:val="0"/>
           <w:numId w:val="21"/>
         </w:numPr>
-        <w:rPr>
-          <w:rFonts w:hint="cs"/>
-        </w:rPr>
       </w:pPr>
       <w:r>
         <w:rPr>
@@ -2713,9 +2752,6 @@
           <w:ilvl w:val="0"/>
           <w:numId w:val="21"/>
         </w:numPr>
-        <w:rPr>
-          <w:rFonts w:hint="cs"/>
-        </w:rPr>
       </w:pPr>
       <w:r>
         <w:rPr>
@@ -2733,9 +2769,6 @@
           <w:ilvl w:val="0"/>
           <w:numId w:val="21"/>
         </w:numPr>
-        <w:rPr>
-          <w:rFonts w:hint="cs"/>
-        </w:rPr>
       </w:pPr>
       <w:r>
         <w:rPr>
@@ -2750,9 +2783,6 @@
           <w:ilvl w:val="0"/>
           <w:numId w:val="21"/>
         </w:numPr>
-        <w:rPr>
-          <w:rFonts w:hint="cs"/>
-        </w:rPr>
       </w:pPr>
       <w:r>
         <w:rPr>
@@ -2854,8 +2884,13 @@
       <w:r>
         <w:t xml:space="preserve">): </w:t>
       </w:r>
-      <w:r>
-        <w:t xml:space="preserve">In December 21, 2026, CRTC </w:t>
+      <w:proofErr w:type="gramStart"/>
+      <w:r>
+        <w:t>In</w:t>
+      </w:r>
+      <w:proofErr w:type="gramEnd"/>
+      <w:r>
+        <w:t xml:space="preserve"> December 21, 2026, CRTC </w:t>
       </w:r>
       <w:r>
         <w:t>recognized the</w:t>
@@ -2900,13 +2935,7 @@
         <w:t>The Internet Code</w:t>
       </w:r>
       <w:r>
-        <w:t>(</w:t>
-      </w:r>
-      <w:r>
-        <w:t>https://crtc.gc.ca/eng/archive/2019/2019-269.htm</w:t>
-      </w:r>
-      <w:r>
-        <w:t xml:space="preserve">): </w:t>
+        <w:t xml:space="preserve">(https://crtc.gc.ca/eng/archive/2019/2019-269.htm): </w:t>
       </w:r>
       <w:r>
         <w:t xml:space="preserve">This code was established by the </w:t>
@@ -2957,21 +2986,7 @@
           <w:i/>
           <w:iCs/>
         </w:rPr>
-        <w:t xml:space="preserve"> (</w:t>
-      </w:r>
-      <w:r>
-        <w:rPr>
-          <w:i/>
-          <w:iCs/>
-        </w:rPr>
-        <w:t>https://www.canada.ca/en/employment-social-development/programs/accessible-canada.html</w:t>
-      </w:r>
-      <w:r>
-        <w:rPr>
-          <w:i/>
-          <w:iCs/>
-        </w:rPr>
-        <w:t>):</w:t>
+        <w:t xml:space="preserve"> (https://www.canada.ca/en/employment-social-development/programs/accessible-canada.html):</w:t>
       </w:r>
       <w:r>
         <w:rPr>
@@ -3042,16 +3057,7 @@
         <w:t xml:space="preserve">the standard </w:t>
       </w:r>
       <w:r>
-        <w:t>CAN/ASC - EN 301 549</w:t>
-      </w:r>
-      <w:r>
-        <w:t>(</w:t>
-      </w:r>
-      <w:r>
-        <w:t>https://accessible.canada.ca/creating-accessibility-standards/canasc-en-301-5492024-accessibility-requirements-ict-products-and-services</w:t>
-      </w:r>
-      <w:r>
-        <w:t>)</w:t>
+        <w:t>CAN/ASC - EN 301 549(https://accessible.canada.ca/creating-accessibility-standards/canasc-en-301-5492024-accessibility-requirements-ict-products-and-services)</w:t>
       </w:r>
       <w:r>
         <w:t>.</w:t>
@@ -3167,9 +3173,6 @@
           <w:ilvl w:val="0"/>
           <w:numId w:val="26"/>
         </w:numPr>
-        <w:rPr>
-          <w:rFonts w:hint="cs"/>
-        </w:rPr>
       </w:pPr>
       <w:r>
         <w:rPr>
@@ -3187,9 +3190,6 @@
           <w:ilvl w:val="0"/>
           <w:numId w:val="26"/>
         </w:numPr>
-        <w:rPr>
-          <w:rFonts w:hint="cs"/>
-        </w:rPr>
       </w:pPr>
       <w:r>
         <w:rPr>
@@ -3207,9 +3207,6 @@
           <w:ilvl w:val="0"/>
           <w:numId w:val="26"/>
         </w:numPr>
-        <w:rPr>
-          <w:rFonts w:hint="cs"/>
-        </w:rPr>
       </w:pPr>
       <w:r>
         <w:rPr>
@@ -7872,6 +7869,7 @@
   <w:style w:type="character" w:default="1" w:styleId="DefaultParagraphFont">
     <w:name w:val="Default Paragraph Font"/>
     <w:uiPriority w:val="1"/>
+    <w:semiHidden/>
     <w:unhideWhenUsed/>
   </w:style>
   <w:style w:type="table" w:default="1" w:styleId="TableNormal">

</xml_diff>